<commit_message>
Removes outdated course docs and updates club constitution
Deletes legacy cryptography and identity management materials to streamline course content.

Updates MCCSVA constitution for clarity on officer eligibility, advisor responsibilities, and club policy alignment; revises language to reflect MCC-specific requirements.

Refreshes officer interest and club status spreadsheets to support current organization needs.
</commit_message>
<xml_diff>
--- a/McLennan-Community-College/_MCCSVA/MCCSVA Constitution 2026.docx
+++ b/McLennan-Community-College/_MCCSVA/MCCSVA Constitution 2026.docx
@@ -214,6 +214,7 @@
         <w:t xml:space="preserve"> The McLennan Community College Student Veterans of America (MCCSVA) </w:t>
       </w:r>
       <w:bookmarkStart w:id="0" w:name="_Int_1WmXqtd2"/>
+      <w:proofErr w:type="gramStart"/>
       <w:r>
         <w:rPr>
           <w:rFonts w:ascii="Times New Roman" w:hAnsi="Times New Roman" w:cs="Times New Roman"/>
@@ -221,6 +222,7 @@
         <w:t>is dedicated to providing</w:t>
       </w:r>
       <w:bookmarkEnd w:id="0"/>
+      <w:proofErr w:type="gramEnd"/>
       <w:r>
         <w:rPr>
           <w:rFonts w:ascii="Times New Roman" w:hAnsi="Times New Roman" w:cs="Times New Roman"/>
@@ -306,13 +308,27 @@
         <w:rPr>
           <w:rFonts w:ascii="Times New Roman" w:hAnsi="Times New Roman" w:cs="Times New Roman"/>
         </w:rPr>
-        <w:t xml:space="preserve"> To promote awareness of veterans' issues and ensure members are informed of benefits</w:t>
-      </w:r>
+        <w:t xml:space="preserve"> To promote awareness of veterans' issues and ensure members are informed of </w:t>
+      </w:r>
+      <w:proofErr w:type="gramStart"/>
       <w:r>
         <w:rPr>
           <w:rFonts w:ascii="Times New Roman" w:hAnsi="Times New Roman" w:cs="Times New Roman"/>
         </w:rPr>
-        <w:t xml:space="preserve">, and </w:t>
+        <w:t>benefits</w:t>
+      </w:r>
+      <w:r>
+        <w:rPr>
+          <w:rFonts w:ascii="Times New Roman" w:hAnsi="Times New Roman" w:cs="Times New Roman"/>
+        </w:rPr>
+        <w:t>, and</w:t>
+      </w:r>
+      <w:proofErr w:type="gramEnd"/>
+      <w:r>
+        <w:rPr>
+          <w:rFonts w:ascii="Times New Roman" w:hAnsi="Times New Roman" w:cs="Times New Roman"/>
+        </w:rPr>
+        <w:t xml:space="preserve"> </w:t>
       </w:r>
       <w:r>
         <w:rPr>
@@ -537,18 +553,23 @@
           <w:numId w:val="2"/>
         </w:numPr>
       </w:pPr>
-      <w:r>
-        <w:t xml:space="preserve">In order for this provision to be met, at least </w:t>
-      </w:r>
-      <w:r>
-        <w:rPr>
-          <w:b/>
-          <w:bCs/>
-        </w:rPr>
-        <w:t>six hours</w:t>
-      </w:r>
-      <w:r>
-        <w:t xml:space="preserve"> (half-time credits) must have been taken for the semester under consideration.</w:t>
+      <w:proofErr w:type="gramStart"/>
+      <w:r>
+        <w:t>In order for</w:t>
+      </w:r>
+      <w:proofErr w:type="gramEnd"/>
+      <w:r>
+        <w:t xml:space="preserve"> this provision to be met, at least </w:t>
+      </w:r>
+      <w:r>
+        <w:rPr>
+          <w:b/>
+          <w:bCs/>
+        </w:rPr>
+        <w:t>six credit hours</w:t>
+      </w:r>
+      <w:r>
+        <w:t xml:space="preserve"> must have been taken for the semester under consideration.</w:t>
       </w:r>
     </w:p>
     <w:p>
@@ -571,7 +592,43 @@
           <w:kern w:val="0"/>
           <w14:ligatures w14:val="none"/>
         </w:rPr>
-        <w:t>In one limited circumstance, summer semester hours may be applied to this provision. In order for summer coursework to qualify toward a grade point ratio prior to election/appointment, at least six credit hours must have been taken during the course of either the full or two summer session(s).</w:t>
+        <w:t xml:space="preserve">In one limited circumstance, summer semester hours may be applied to this provision. </w:t>
+      </w:r>
+      <w:proofErr w:type="gramStart"/>
+      <w:r>
+        <w:rPr>
+          <w:rFonts w:ascii="Times New Roman" w:eastAsia="Times New Roman" w:hAnsi="Times New Roman" w:cs="Times New Roman"/>
+          <w:kern w:val="0"/>
+          <w14:ligatures w14:val="none"/>
+        </w:rPr>
+        <w:t>In order for</w:t>
+      </w:r>
+      <w:proofErr w:type="gramEnd"/>
+      <w:r>
+        <w:rPr>
+          <w:rFonts w:ascii="Times New Roman" w:eastAsia="Times New Roman" w:hAnsi="Times New Roman" w:cs="Times New Roman"/>
+          <w:kern w:val="0"/>
+          <w14:ligatures w14:val="none"/>
+        </w:rPr>
+        <w:t xml:space="preserve"> summer coursework to qualify toward a grade point ratio prior to election/appointment, at least six credit hours must have been taken </w:t>
+      </w:r>
+      <w:proofErr w:type="gramStart"/>
+      <w:r>
+        <w:rPr>
+          <w:rFonts w:ascii="Times New Roman" w:eastAsia="Times New Roman" w:hAnsi="Times New Roman" w:cs="Times New Roman"/>
+          <w:kern w:val="0"/>
+          <w14:ligatures w14:val="none"/>
+        </w:rPr>
+        <w:t>during the course of</w:t>
+      </w:r>
+      <w:proofErr w:type="gramEnd"/>
+      <w:r>
+        <w:rPr>
+          <w:rFonts w:ascii="Times New Roman" w:eastAsia="Times New Roman" w:hAnsi="Times New Roman" w:cs="Times New Roman"/>
+          <w:kern w:val="0"/>
+          <w14:ligatures w14:val="none"/>
+        </w:rPr>
+        <w:t xml:space="preserve"> either the full or two summer session(s).</w:t>
       </w:r>
     </w:p>
     <w:p>
@@ -586,7 +643,21 @@
         <w:t>Section 5:</w:t>
       </w:r>
       <w:r>
-        <w:t xml:space="preserve"> Standing Officers must be in good standing with the university and enrolled:</w:t>
+        <w:t xml:space="preserve"> Standing Officers must be in good standing with the </w:t>
+      </w:r>
+      <w:r>
+        <w:t>college</w:t>
+      </w:r>
+      <w:r>
+        <w:t xml:space="preserve"> and </w:t>
+      </w:r>
+      <w:proofErr w:type="gramStart"/>
+      <w:r>
+        <w:t>enrolled</w:t>
+      </w:r>
+      <w:proofErr w:type="gramEnd"/>
+      <w:r>
+        <w:t>:</w:t>
       </w:r>
     </w:p>
     <w:p>
@@ -598,7 +669,35 @@
         </w:numPr>
       </w:pPr>
       <w:r>
-        <w:t>At least half-time (six or more credit hours), if an undergraduate student, during the term of office.</w:t>
+        <w:t>At least half-time (</w:t>
+      </w:r>
+      <w:r>
+        <w:t xml:space="preserve">minimum six </w:t>
+      </w:r>
+      <w:r>
+        <w:t>credit hours), if an undergraduate student, during the term of office.</w:t>
+      </w:r>
+      <w:r>
+        <w:t xml:space="preserve"> </w:t>
+      </w:r>
+      <w:r>
+        <w:t xml:space="preserve">Since this is an MCC student organization, University Center (UCEN) students cannot hold </w:t>
+      </w:r>
+      <w:proofErr w:type="gramStart"/>
+      <w:r>
+        <w:t>officer</w:t>
+      </w:r>
+      <w:proofErr w:type="gramEnd"/>
+      <w:r>
+        <w:t xml:space="preserve"> positions or vote. They can be active members and participate </w:t>
+      </w:r>
+      <w:proofErr w:type="gramStart"/>
+      <w:r>
+        <w:t>at</w:t>
+      </w:r>
+      <w:proofErr w:type="gramEnd"/>
+      <w:r>
+        <w:t xml:space="preserve"> club events, but their membership status is different from MCC students.</w:t>
       </w:r>
     </w:p>
     <w:p>
@@ -610,18 +709,6 @@
         </w:numPr>
       </w:pPr>
       <w:r>
-        <w:t>Students enrolled in UCEN are also eligible to hold an office, as long as the student is meeting all applicable UCEN requirements and is in good standing with the program.</w:t>
-      </w:r>
-    </w:p>
-    <w:p>
-      <w:pPr>
-        <w:pStyle w:val="NormalWeb"/>
-        <w:numPr>
-          <w:ilvl w:val="0"/>
-          <w:numId w:val="10"/>
-        </w:numPr>
-      </w:pPr>
-      <w:r>
         <w:t>If an officer does not meet either of the above requirements, they will be placed on a probationary semester.</w:t>
       </w:r>
     </w:p>
@@ -682,17 +769,10 @@
         <w:t xml:space="preserve"> Upon graduation or transfer, active members transition to Alumni Membership. Alumni members are encouraged to attend general meetings, social events, and serve as mentors. However, Alumni members </w:t>
       </w:r>
       <w:r>
-        <w:rPr>
-          <w:b/>
-          <w:bCs/>
-        </w:rPr>
         <w:t>shall not hold executive office, nor shall they hold voting privileges</w:t>
       </w:r>
       <w:r>
-        <w:t xml:space="preserve"> on official organization business</w:t>
-      </w:r>
-      <w:r>
-        <w:t>.</w:t>
+        <w:t xml:space="preserve"> on official organization business.</w:t>
       </w:r>
     </w:p>
     <w:p>
@@ -763,7 +843,13 @@
         <w:t>Rules and Regulations Violation:</w:t>
       </w:r>
       <w:r>
-        <w:t xml:space="preserve"> Failure to comply with all University Rules and Regulations and the MCCSVA Constitution will be grounds for disciplinary action, including immediate removal.</w:t>
+        <w:t xml:space="preserve"> </w:t>
+      </w:r>
+      <w:r>
+        <w:t>Failure to comply with college policy and the MCCSVA Constitution will be grounds for disciplinary action, including immediate removal</w:t>
+      </w:r>
+      <w:r>
+        <w:t>.</w:t>
       </w:r>
     </w:p>
     <w:p>
@@ -795,22 +881,21 @@
           <w:bCs/>
         </w:rPr>
         <w:lastRenderedPageBreak/>
-        <w:t>Section 2: Alcohol Policy Violation</w:t>
-      </w:r>
-      <w:r>
-        <w:t xml:space="preserve"> MCCSVA adheres strictly to the McLennan Community College alcohol policy. Any member found in violation during an official event will be subject to immediate disciplinary procedures.</w:t>
-      </w:r>
-    </w:p>
-    <w:p>
-      <w:pPr>
-        <w:pStyle w:val="NormalWeb"/>
-      </w:pPr>
-      <w:r>
-        <w:rPr>
-          <w:b/>
-          <w:bCs/>
-        </w:rPr>
-        <w:t>Section 3: Process of Removal</w:t>
+        <w:t xml:space="preserve">Section </w:t>
+      </w:r>
+      <w:r>
+        <w:rPr>
+          <w:b/>
+          <w:bCs/>
+        </w:rPr>
+        <w:t>2</w:t>
+      </w:r>
+      <w:r>
+        <w:rPr>
+          <w:b/>
+          <w:bCs/>
+        </w:rPr>
+        <w:t>: Process of Removal</w:t>
       </w:r>
     </w:p>
     <w:p>
@@ -829,13 +914,53 @@
         <w:t>Notification:</w:t>
       </w:r>
       <w:r>
-        <w:t xml:space="preserve"> When a violation occurs, the member in question will receive a notice by email from the President. The member will have 24 hours to respond to set up a meeting time with the officer team.</w:t>
+        <w:t xml:space="preserve"> When a violation occurs, the member in question will receive a notice by email from the President. The </w:t>
+      </w:r>
+      <w:proofErr w:type="gramStart"/>
+      <w:r>
+        <w:t>member</w:t>
+      </w:r>
+      <w:proofErr w:type="gramEnd"/>
+      <w:r>
+        <w:t xml:space="preserve"> will have 24 hours to respond to </w:t>
+      </w:r>
+      <w:proofErr w:type="gramStart"/>
+      <w:r>
+        <w:t>set</w:t>
+      </w:r>
+      <w:proofErr w:type="gramEnd"/>
+      <w:r>
+        <w:t xml:space="preserve"> up a meeting time with the </w:t>
+      </w:r>
+      <w:proofErr w:type="gramStart"/>
+      <w:r>
+        <w:t>officer</w:t>
+      </w:r>
+      <w:proofErr w:type="gramEnd"/>
+      <w:r>
+        <w:t xml:space="preserve"> team.</w:t>
       </w:r>
       <w:r>
         <w:t xml:space="preserve"> </w:t>
       </w:r>
       <w:r>
-        <w:t>Failure to respond within the 24-hour window, or failure to appear at the scheduled hearing, will result in the forfeiture of the member's right to defense. The officer team will then proceed with the review and vote in the member's absence.</w:t>
+        <w:t xml:space="preserve">Failure to respond within the 24-hour window, or failure to appear at the scheduled hearing, will result in the forfeiture of the member's right to </w:t>
+      </w:r>
+      <w:proofErr w:type="gramStart"/>
+      <w:r>
+        <w:t>defense</w:t>
+      </w:r>
+      <w:proofErr w:type="gramEnd"/>
+      <w:r>
+        <w:t xml:space="preserve">. The </w:t>
+      </w:r>
+      <w:proofErr w:type="gramStart"/>
+      <w:r>
+        <w:t>officer</w:t>
+      </w:r>
+      <w:proofErr w:type="gramEnd"/>
+      <w:r>
+        <w:t xml:space="preserve"> team will then proceed with the review and vote in the member's absence.</w:t>
       </w:r>
     </w:p>
     <w:p>
@@ -854,7 +979,15 @@
         <w:t>Hearing:</w:t>
       </w:r>
       <w:r>
-        <w:t xml:space="preserve"> At this meeting, the violation will be discussed with the member by the officer team before a final decision is made.</w:t>
+        <w:t xml:space="preserve"> At this meeting, the violation will be discussed with the member </w:t>
+      </w:r>
+      <w:proofErr w:type="gramStart"/>
+      <w:r>
+        <w:t>by</w:t>
+      </w:r>
+      <w:proofErr w:type="gramEnd"/>
+      <w:r>
+        <w:t xml:space="preserve"> the officer team before a final decision is made.</w:t>
       </w:r>
     </w:p>
     <w:p>
@@ -1041,7 +1174,13 @@
         <w:t>Section 4: Treasurer</w:t>
       </w:r>
       <w:r>
-        <w:t xml:space="preserve"> The duties of the Treasurer shall be to:</w:t>
+        <w:t xml:space="preserve"> The duties of the Treasurer</w:t>
+      </w:r>
+      <w:r>
+        <w:t>, with the assistance of the Advisor,</w:t>
+      </w:r>
+      <w:r>
+        <w:t xml:space="preserve"> shall be to:</w:t>
       </w:r>
     </w:p>
     <w:p>
@@ -1117,7 +1256,15 @@
         <w:t>Section 1: Terms of Office</w:t>
       </w:r>
       <w:r>
-        <w:t xml:space="preserve"> Officers shall serve for one academic year, from May 1 to April 30.</w:t>
+        <w:t xml:space="preserve"> </w:t>
+      </w:r>
+      <w:proofErr w:type="gramStart"/>
+      <w:r>
+        <w:t>Officers shall</w:t>
+      </w:r>
+      <w:proofErr w:type="gramEnd"/>
+      <w:r>
+        <w:t xml:space="preserve"> serve for one academic year, from May 1 to April 30.</w:t>
       </w:r>
     </w:p>
     <w:p>
@@ -1257,13 +1404,26 @@
         <w:t>Section 1: Role</w:t>
       </w:r>
       <w:r>
-        <w:t xml:space="preserve"> The advisor(s) should be a mentor to MCCSVA and be active in the functions of the organization to the best of their ability. The primary and secondary advisor will be selected from willing MCC faculty/staff members.</w:t>
-      </w:r>
-      <w:r>
         <w:t xml:space="preserve"> </w:t>
       </w:r>
       <w:r>
-        <w:t>If a willing faculty/staff advisor cannot be identified, the Executive Officer Team shall immediately petition the Office of Student Life for assistance in locating a temporary advisor or for a temporary waiver to maintain active status.</w:t>
+        <w:t xml:space="preserve">The advisor(s) should be a mentor to MCCSVA and be active in the functions of the organization to the best of their ability. The primary and secondary </w:t>
+      </w:r>
+      <w:proofErr w:type="gramStart"/>
+      <w:r>
+        <w:t>advisor</w:t>
+      </w:r>
+      <w:proofErr w:type="gramEnd"/>
+      <w:r>
+        <w:t xml:space="preserve"> will be selected from willing MCC faculty/staff members. It is the responsibility of the students within the organization to find a replacement if a willing faculty/staff advisor cannot be identified. Failure to have an advisor for a club will result in the club falling into inactive status until a new advisor can take over. During that time, any club events will </w:t>
+      </w:r>
+      <w:proofErr w:type="gramStart"/>
+      <w:r>
+        <w:t>be put on hold</w:t>
+      </w:r>
+      <w:proofErr w:type="gramEnd"/>
+      <w:r>
+        <w:t xml:space="preserve"> or canceled.</w:t>
       </w:r>
     </w:p>
     <w:p>
@@ -1278,7 +1438,18 @@
         <w:t>Section 2: Duties</w:t>
       </w:r>
       <w:r>
-        <w:t xml:space="preserve"> He or she will maintain the logistical support of MCCSVA by providing necessary signatures and documents to the Student Life Office.</w:t>
+        <w:t xml:space="preserve"> </w:t>
+      </w:r>
+      <w:r>
+        <w:t xml:space="preserve">He or she will maintain the logistical support of MCCSVA by providing necessary signatures and documents to the Student Life Office. The other duties of the advisor are to be the college representative and ensure that the student organization </w:t>
+      </w:r>
+      <w:proofErr w:type="gramStart"/>
+      <w:r>
+        <w:t>stays in alignment</w:t>
+      </w:r>
+      <w:proofErr w:type="gramEnd"/>
+      <w:r>
+        <w:t xml:space="preserve"> with college policy.</w:t>
       </w:r>
     </w:p>
     <w:p>
@@ -1350,18 +1521,6 @@
     </w:p>
     <w:p>
       <w:pPr>
-        <w:rPr>
-          <w:rFonts w:ascii="Times New Roman" w:eastAsia="Times New Roman" w:hAnsi="Times New Roman" w:cs="Times New Roman"/>
-          <w:kern w:val="0"/>
-          <w14:ligatures w14:val="none"/>
-        </w:rPr>
-      </w:pPr>
-      <w:r>
-        <w:br w:type="page"/>
-      </w:r>
-    </w:p>
-    <w:p>
-      <w:pPr>
         <w:pStyle w:val="NormalWeb"/>
       </w:pPr>
       <w:r>
@@ -1377,8 +1536,13 @@
       <w:pPr>
         <w:pStyle w:val="NormalWeb"/>
       </w:pPr>
-      <w:r>
-        <w:t>In order to maintain active status, the organization agrees to abide by those rules and regulations of MCC which pertain to all student organizations as outlined in the Highlander Guide and the MCC Policies and Procedures.</w:t>
+      <w:proofErr w:type="gramStart"/>
+      <w:r>
+        <w:t>In order to</w:t>
+      </w:r>
+      <w:proofErr w:type="gramEnd"/>
+      <w:r>
+        <w:t xml:space="preserve"> maintain active status, the organization agrees to abide by those rules and regulations of MCC which pertain to all student organizations as outlined in the Highlander Guide and the MCC Policies and Procedures.</w:t>
       </w:r>
     </w:p>
     <w:p>
@@ -1983,7 +2147,7 @@
       </w:pPr>
     </w:p>
     <w:sectPr>
-      <w:pgSz w:w="12240" w:h="15840"/>
+      <w:pgSz w:w="12240" w:h="15840" w:code="1"/>
       <w:pgMar w:top="1440" w:right="1440" w:bottom="1440" w:left="1440" w:header="720" w:footer="720" w:gutter="0"/>
       <w:cols w:space="720"/>
       <w:docGrid w:linePitch="360"/>
@@ -4059,6 +4223,7 @@
   <w:style w:type="character" w:default="1" w:styleId="DefaultParagraphFont">
     <w:name w:val="Default Paragraph Font"/>
     <w:uiPriority w:val="1"/>
+    <w:semiHidden/>
     <w:unhideWhenUsed/>
   </w:style>
   <w:style w:type="table" w:default="1" w:styleId="TableNormal">

</xml_diff>